<commit_message>
docs(report): 개발보고서 5장에 P3g~P3i 반영 + docx/pdf 재생성
생성기 _gen_dev_report.py: C# 인터롭 장(5장)에 P3g(워크플로 재설계: 비동기 로드·
장애물 우선 표시·탐색범위/드릴다운), P3h(DB 레이어 확장: 장비·레터럴/덕트·공간영역,
점유맵 원본/샘플·중앙정렬), P3i(단계별 A* 탐색 애니메이션·꺾임 구간 리스트) 추가.
결론 요약을 P0~P3i 로 갱신. docs/routing3d_dev_report.{docx,pdf} Word COM 으로 재빌드.

Co-Authored-By: Claude Opus 4.8 (1M context) <noreply@anthropic.com>
</commit_message>
<xml_diff>
--- a/docs/routing3d_dev_report.docx
+++ b/docs/routing3d_dev_report.docx
@@ -8370,7 +8370,7 @@
           <w:b w:val="0"/>
           <w:sz w:val="21"/>
         </w:rPr>
-        <w:t>엔진은 C++ 로 두고 가시화를 C#(WPF + HelixToolkit)로 구현한다. C++ 코어를 의존성 없는 단일 DLL(C ABI)로 노출하고, C# 가 P/Invoke 로 호출해 라우팅 결과를 3D 로 그린다. 단계 P0(DLL) → P1(뷰어) → P2(인터랙티브) → P3a(뷰어 기능) → P3b(대형장면 corridor) → P3c(scene.txt CLI/--selftest) → P3d(SpaceAI 다크 UI·검색·필터·전체보기) → P3e(3D 신규 레이어 3종: 복셀 전체맵/점유맵/방문맵) → P3f(PostgreSQL 자동 로드).</w:t>
+        <w:t>엔진은 C++ 로 두고 가시화를 C#(WPF + HelixToolkit)로 구현한다. C++ 코어를 의존성 없는 단일 DLL(C ABI)로 노출하고, C# 가 P/Invoke 로 호출해 라우팅 결과를 3D 로 그린다. 단계 P0(DLL) → P1(뷰어) → P2(인터랙티브) → P3a(뷰어 기능) → P3b(대형장면 corridor) → P3c(scene.txt CLI/--selftest) → P3d(SpaceAI 다크 UI·검색·필터·전체보기) → P3e(3D 신규 레이어 3종: 복셀 전체맵/점유맵/방문맵) → P3f(PostgreSQL 자동 로드) → P3g(워크플로 재설계: 비동기 로드·장애물 우선·탐색범위 선택·드릴다운) → P3h(DB 레이어 확장: 장비·레터럴/덕트·공간영역) → P3i(단계별 A* 탐색 시각화).</w:t>
       </w:r>
     </w:p>
     <w:p>
@@ -9160,6 +9160,102 @@
           </w:p>
         </w:tc>
       </w:tr>
+      <w:tr>
+        <w:tc>
+          <w:tcPr>
+            <w:tcW w:type="dxa" w:w="4320"/>
+          </w:tcPr>
+          <w:p>
+            <w:r>
+              <w:rPr>
+                <w:rFonts w:ascii="Consolas" w:hAnsi="Consolas" w:eastAsia="Malgun Gothic"/>
+                <w:b w:val="0"/>
+                <w:sz w:val="18"/>
+              </w:rPr>
+              <w:t>P3g 워크플로 재설계</w:t>
+            </w:r>
+          </w:p>
+        </w:tc>
+        <w:tc>
+          <w:tcPr>
+            <w:tcW w:type="dxa" w:w="4320"/>
+          </w:tcPr>
+          <w:p>
+            <w:r>
+              <w:rPr>
+                <w:rFonts w:ascii="Malgun Gothic" w:hAnsi="Malgun Gothic" w:eastAsia="Malgun Gothic"/>
+                <w:b w:val="0"/>
+                <w:sz w:val="18"/>
+              </w:rPr>
+              <w:t>창 즉시 표시 + DB 비동기 로드(UI 비차단). 프로젝트 선택 시 장애물만 표시(자동 라우팅 제거) → 탐색 범위(모두/유틸리티그룹별/유틸리티별) 선택 실행. 좌측 드릴다운(그룹→유틸→개별 PoC, PoC 선택 3D 강조).</w:t>
+            </w:r>
+          </w:p>
+        </w:tc>
+      </w:tr>
+      <w:tr>
+        <w:tc>
+          <w:tcPr>
+            <w:tcW w:type="dxa" w:w="4320"/>
+          </w:tcPr>
+          <w:p>
+            <w:r>
+              <w:rPr>
+                <w:rFonts w:ascii="Consolas" w:hAnsi="Consolas" w:eastAsia="Malgun Gothic"/>
+                <w:b w:val="0"/>
+                <w:sz w:val="18"/>
+              </w:rPr>
+              <w:t>P3h DB 레이어 확장</w:t>
+            </w:r>
+          </w:p>
+        </w:tc>
+        <w:tc>
+          <w:tcPr>
+            <w:tcW w:type="dxa" w:w="4320"/>
+          </w:tcPr>
+          <w:p>
+            <w:r>
+              <w:rPr>
+                <w:rFonts w:ascii="Malgun Gothic" w:hAnsi="Malgun Gothic" w:eastAsia="Malgun Gothic"/>
+                <w:b w:val="0"/>
+                <w:sz w:val="18"/>
+              </w:rPr>
+              <w:t>장비(TB_BIM_EQUIPMENT, 메인/서브 색) · 레터럴/덕트(TB_DUCT_LATERAL, CATEGORY별 토글) · 공간영역(TB_BIM_SPACE_INFO.LEVEL_NAME=CR/A/F/CSF, 와이어+텍스트 라벨). PoC 이름 로드. 점유맵 빈틈없는 큐브+원본/샘플 토글. 바닥격자 씬 정렬로 객체 중앙 정렬.</w:t>
+            </w:r>
+          </w:p>
+        </w:tc>
+      </w:tr>
+      <w:tr>
+        <w:tc>
+          <w:tcPr>
+            <w:tcW w:type="dxa" w:w="4320"/>
+          </w:tcPr>
+          <w:p>
+            <w:r>
+              <w:rPr>
+                <w:rFonts w:ascii="Consolas" w:hAnsi="Consolas" w:eastAsia="Malgun Gothic"/>
+                <w:b w:val="0"/>
+                <w:sz w:val="18"/>
+              </w:rPr>
+              <w:t>P3i 탐색 시각화</w:t>
+            </w:r>
+          </w:p>
+        </w:tc>
+        <w:tc>
+          <w:tcPr>
+            <w:tcW w:type="dxa" w:w="4320"/>
+          </w:tcPr>
+          <w:p>
+            <w:r>
+              <w:rPr>
+                <w:rFonts w:ascii="Malgun Gothic" w:hAnsi="Malgun Gothic" w:eastAsia="Malgun Gothic"/>
+                <w:b w:val="0"/>
+                <w:sz w:val="18"/>
+              </w:rPr>
+              <w:t>선택 배관 단계별 A* 애니메이션(방문셀 확장순서로 점진 표시→경로 회피 과정). 경로 방향전환(꺾임) 마젠타 마커 + 우측 구간 단계 리스트(방향·길이, 클릭 시 카메라 이동).</w:t>
+            </w:r>
+          </w:p>
+        </w:tc>
+      </w:tr>
     </w:tbl>
     <w:p>
       <w:pPr>
@@ -9262,6 +9358,149 @@
           <w:sz w:val="21"/>
         </w:rPr>
         <w:t>scene.txt 인자 없으면 LoadProjects → 자동 선택. DB 실패 시 LoadDemo 폴백.</w:t>
+      </w:r>
+    </w:p>
+    <w:p>
+      <w:pPr>
+        <w:pStyle w:val="Heading3"/>
+      </w:pPr>
+      <w:r>
+        <w:rPr>
+          <w:rFonts w:ascii="Malgun Gothic" w:hAnsi="Malgun Gothic" w:eastAsia="Malgun Gothic"/>
+          <w:b/>
+          <w:color w:val="2E5496"/>
+          <w:sz w:val="22"/>
+        </w:rPr>
+        <w:t>P3g 워크플로 재설계 (UX)</w:t>
+      </w:r>
+    </w:p>
+    <w:p>
+      <w:pPr>
+        <w:pStyle w:val="ListBullet"/>
+      </w:pPr>
+      <w:r>
+        <w:rPr>
+          <w:rFonts w:ascii="Malgun Gothic" w:hAnsi="Malgun Gothic" w:eastAsia="Malgun Gothic"/>
+          <w:b w:val="0"/>
+          <w:sz w:val="21"/>
+        </w:rPr>
+        <w:t>비동기 로드: MainWindow.ContentRendered 후 RunStartupLoadAsync 가 DB 목록/로드를 수행하고 무거운 RouteMulti 는 Task.Run(백그라운드) → 창이 즉시 뜨고 UI 가 멈추지 않음(이전엔 첫 라우팅이 끝나야 창 표시).</w:t>
+      </w:r>
+    </w:p>
+    <w:p>
+      <w:pPr>
+        <w:pStyle w:val="ListBullet"/>
+      </w:pPr>
+      <w:r>
+        <w:rPr>
+          <w:rFonts w:ascii="Malgun Gothic" w:hAnsi="Malgun Gothic" w:eastAsia="Malgun Gothic"/>
+          <w:b w:val="0"/>
+          <w:sz w:val="21"/>
+        </w:rPr>
+        <w:t>프로젝트 선택 시 장애물·격자만 로드해 전체화면 표시(자동 라우팅 제거). 상단 '탐색 범위' 콤보(모두/유틸리티그룹별/유틸리티별)와 대상 콤보로 부분집합을 골라 '경로 탐색 실행'. 부분집합은 엔진을 해당 작업만으로 재구성해 route_multi → 결과 경로를 행에 캐시(렌더는 엔진 상태와 분리).</w:t>
+      </w:r>
+    </w:p>
+    <w:p>
+      <w:pPr>
+        <w:pStyle w:val="ListBullet"/>
+      </w:pPr>
+      <w:r>
+        <w:rPr>
+          <w:rFonts w:ascii="Malgun Gothic" w:hAnsi="Malgun Gothic" w:eastAsia="Malgun Gothic"/>
+          <w:b w:val="0"/>
+          <w:sz w:val="21"/>
+        </w:rPr>
+        <w:t>좌측 패널 드릴다운: 유틸리티 그룹 → 유틸리티 → 개별 PoC(POC_LIST.name/endName). PoC 선택 시 시작/끝점을 3D 마커로 강조. 드릴다운 선택이 상단 탐색 범위/대상을 자동 설정.</w:t>
+      </w:r>
+    </w:p>
+    <w:p>
+      <w:pPr>
+        <w:pStyle w:val="Heading3"/>
+      </w:pPr>
+      <w:r>
+        <w:rPr>
+          <w:rFonts w:ascii="Malgun Gothic" w:hAnsi="Malgun Gothic" w:eastAsia="Malgun Gothic"/>
+          <w:b/>
+          <w:color w:val="2E5496"/>
+          <w:sz w:val="22"/>
+        </w:rPr>
+        <w:t>P3h DB 레이어 확장 / 점유맵 충실도 / 중앙 정렬</w:t>
+      </w:r>
+    </w:p>
+    <w:p>
+      <w:pPr>
+        <w:pStyle w:val="ListBullet"/>
+      </w:pPr>
+      <w:r>
+        <w:rPr>
+          <w:rFonts w:ascii="Malgun Gothic" w:hAnsi="Malgun Gothic" w:eastAsia="Malgun Gothic"/>
+          <w:b w:val="0"/>
+          <w:sz w:val="21"/>
+        </w:rPr>
+        <w:t>장비: TB_BIM_EQUIPMENT(SOURCE_FILE 조건 전체) MIN~MAX → 메인(IS_MAIN, 진한 주황)/서브(옅은 주황) 큐브.</w:t>
+      </w:r>
+    </w:p>
+    <w:p>
+      <w:pPr>
+        <w:pStyle w:val="ListBullet"/>
+      </w:pPr>
+      <w:r>
+        <w:rPr>
+          <w:rFonts w:ascii="Malgun Gothic" w:hAnsi="Malgun Gothic" w:eastAsia="Malgun Gothic"/>
+          <w:b w:val="0"/>
+          <w:sz w:val="21"/>
+        </w:rPr>
+        <w:t>레터럴/덕트: TB_DUCT_LATERAL 한 테이블에 CATEGORY(LATERAL|DUCT)·UTILITY 보유 → 레터럴=초록·덕트=청색, 각각 별도 토글. 두께 0(굽힘) 박스는 렌더 시 최소 40mm 클램프.</w:t>
+      </w:r>
+    </w:p>
+    <w:p>
+      <w:pPr>
+        <w:pStyle w:val="ListBullet"/>
+      </w:pPr>
+      <w:r>
+        <w:rPr>
+          <w:rFonts w:ascii="Malgun Gothic" w:hAnsi="Malgun Gothic" w:eastAsia="Malgun Gothic"/>
+          <w:b w:val="0"/>
+          <w:sz w:val="21"/>
+        </w:rPr>
+        <w:t>공간 영역: TB_BIM_SPACE_INFO.LEVEL_NAME(CR/A/F/CSF)·MIN~MAX → 영역별 색 와이어프레임 + BillboardText 라벨(영역 바깥, 작은 글씨). 프로젝트마다 3층이 Z로 적층.</w:t>
+      </w:r>
+    </w:p>
+    <w:p>
+      <w:pPr>
+        <w:pStyle w:val="ListBullet"/>
+      </w:pPr>
+      <w:r>
+        <w:rPr>
+          <w:rFonts w:ascii="Malgun Gothic" w:hAnsi="Malgun Gothic" w:eastAsia="Malgun Gothic"/>
+          <w:b w:val="0"/>
+          <w:sz w:val="21"/>
+        </w:rPr>
+        <w:t>점유맵: 셀 크기 큐브로 맞닿게 그려 빈틈 제거 + 원본/샘플(상한 15만) 해상도 토글. 바닥격자(GridLinesVisual3D)를 씬 좌표(origin/extent)에 맞춰 ZoomExtents 오정렬을 바로잡아 객체를 중앙에 표시.</w:t>
+      </w:r>
+    </w:p>
+    <w:p>
+      <w:pPr>
+        <w:pStyle w:val="Heading3"/>
+      </w:pPr>
+      <w:r>
+        <w:rPr>
+          <w:rFonts w:ascii="Malgun Gothic" w:hAnsi="Malgun Gothic" w:eastAsia="Malgun Gothic"/>
+          <w:b/>
+          <w:color w:val="2E5496"/>
+          <w:sz w:val="22"/>
+        </w:rPr>
+        <w:t>P3i 단계별 A* 탐색 시각화</w:t>
+      </w:r>
+    </w:p>
+    <w:p>
+      <w:r>
+        <w:rPr>
+          <w:rFonts w:ascii="Malgun Gothic" w:hAnsi="Malgun Gothic" w:eastAsia="Malgun Gothic"/>
+          <w:b w:val="0"/>
+          <w:sz w:val="21"/>
+        </w:rPr>
+        <w:t>엔진이 방문 셀을 A* 확장 순서대로(AStarResult.visited push 순서) 저장하는 점을 이용해, 선택 배관의 탐색 과정을 재생한다. r3d_copy_visited 로 받은 방문 셀을 DispatcherTimer 로 확장 순서대로 점진 표시(점유맵을 켜 회피 대상을 함께 보임)하고, 종료 후 최종 경로를 드러낸다. 또한 경로를 직선 구간으로 나눠 방향이 바뀌는 꺾임점을 마젠타 마커로 찍고, 우측 패널에 구간(단계) 리스트(방향 수직/수평·길이)를 표시해 항목 클릭 시 그 위치로 카메라를 이동한다.</w:t>
       </w:r>
     </w:p>
     <w:p>
@@ -9607,7 +9846,7 @@
           <w:b w:val="0"/>
           <w:sz w:val="21"/>
         </w:rPr>
-        <w:t>C# 인터롭: C ABI DLL + HelixToolkit 뷰어 P0~P3f. SpaceAI 다크 UI/검색/필터/전체보기, 3D 신규 레이어 3종(복셀 전체맵·점유맵·방문맵), 실행 시 PostgreSQL 자동 로드.</w:t>
+        <w:t>C# 인터롭: C ABI DLL + HelixToolkit 뷰어 P0~P3i. SpaceAI 다크 UI/검색/필터/전체보기, 3D 레이어(복셀 전체맵·점유맵·방문맵·장비·레터럴/덕트·공간영역), PostgreSQL 자동 로드, 비동기 로드+장애물 우선 표시+탐색범위/드릴다운 워크플로, 선택 배관 단계별 A* 탐색 애니메이션·꺾임 구간 리스트.</w:t>
       </w:r>
     </w:p>
     <w:p>

</xml_diff>